<commit_message>
Added CRUD for employees
</commit_message>
<xml_diff>
--- a/Payroll Management System.docx
+++ b/Payroll Management System.docx
@@ -1989,17 +1989,7 @@
           <w:szCs w:val="22"/>
           <w:lang w:val="en-IN"/>
         </w:rPr>
-        <w:t>Payrol</w:t>
-      </w:r>
-      <w:r>
-        <w:rPr>
-          <w:rFonts w:ascii="Consolas" w:hAnsi="Consolas"/>
-          <w:color w:val="000000"/>
-          <w:sz w:val="22"/>
-          <w:szCs w:val="22"/>
-          <w:lang w:val="en-IN"/>
-        </w:rPr>
-        <w:t>l</w:t>
+        <w:t>Payroll</w:t>
       </w:r>
     </w:p>
     <w:p>
@@ -3508,6 +3498,7 @@
       <w:pPr>
         <w:pStyle w:val="NormalWeb"/>
         <w:spacing w:before="0" w:beforeAutospacing="0" w:after="0" w:afterAutospacing="0"/>
+        <w:ind w:left="720"/>
         <w:rPr>
           <w:rFonts w:ascii="Consolas" w:hAnsi="Consolas"/>
           <w:color w:val="000000"/>
@@ -3529,6 +3520,7 @@
       <w:pPr>
         <w:pStyle w:val="NormalWeb"/>
         <w:spacing w:before="0" w:beforeAutospacing="0" w:after="0" w:afterAutospacing="0"/>
+        <w:ind w:left="720"/>
         <w:rPr>
           <w:rFonts w:ascii="Consolas" w:hAnsi="Consolas"/>
           <w:color w:val="000000"/>
@@ -3572,6 +3564,7 @@
       <w:pPr>
         <w:pStyle w:val="NormalWeb"/>
         <w:spacing w:before="0" w:beforeAutospacing="0" w:after="0" w:afterAutospacing="0"/>
+        <w:ind w:left="720"/>
         <w:rPr>
           <w:rFonts w:ascii="Consolas" w:hAnsi="Consolas"/>
           <w:color w:val="000000"/>
@@ -3593,6 +3586,7 @@
       <w:pPr>
         <w:pStyle w:val="NormalWeb"/>
         <w:spacing w:before="0" w:beforeAutospacing="0" w:after="0" w:afterAutospacing="0"/>
+        <w:ind w:left="720"/>
         <w:rPr>
           <w:rFonts w:ascii="Consolas" w:hAnsi="Consolas"/>
           <w:color w:val="000000"/>
@@ -3654,6 +3648,7 @@
       <w:pPr>
         <w:pStyle w:val="NormalWeb"/>
         <w:spacing w:before="0" w:beforeAutospacing="0" w:after="0" w:afterAutospacing="0"/>
+        <w:ind w:left="720"/>
         <w:rPr>
           <w:rFonts w:ascii="Consolas" w:hAnsi="Consolas"/>
           <w:color w:val="000000"/>
@@ -3675,6 +3670,7 @@
       <w:pPr>
         <w:pStyle w:val="NormalWeb"/>
         <w:spacing w:before="0" w:beforeAutospacing="0" w:after="0" w:afterAutospacing="0"/>
+        <w:ind w:left="720"/>
         <w:rPr>
           <w:rFonts w:ascii="Consolas" w:hAnsi="Consolas"/>
           <w:color w:val="000000"/>
@@ -3696,6 +3692,7 @@
       <w:pPr>
         <w:pStyle w:val="NormalWeb"/>
         <w:spacing w:before="0" w:beforeAutospacing="0" w:after="0" w:afterAutospacing="0"/>
+        <w:ind w:left="720"/>
         <w:rPr>
           <w:rFonts w:ascii="Consolas" w:hAnsi="Consolas"/>
           <w:color w:val="000000"/>
@@ -3717,6 +3714,7 @@
       <w:pPr>
         <w:pStyle w:val="NormalWeb"/>
         <w:spacing w:before="0" w:beforeAutospacing="0" w:after="0" w:afterAutospacing="0"/>
+        <w:ind w:left="720"/>
         <w:rPr>
           <w:rFonts w:ascii="Consolas" w:hAnsi="Consolas"/>
           <w:color w:val="000000"/>
@@ -3738,6 +3736,7 @@
       <w:pPr>
         <w:pStyle w:val="NormalWeb"/>
         <w:spacing w:before="0" w:beforeAutospacing="0" w:after="0" w:afterAutospacing="0"/>
+        <w:ind w:left="720"/>
         <w:rPr>
           <w:rFonts w:ascii="Consolas" w:hAnsi="Consolas"/>
           <w:color w:val="000000"/>
@@ -3759,6 +3758,7 @@
       <w:pPr>
         <w:pStyle w:val="NormalWeb"/>
         <w:spacing w:before="0" w:beforeAutospacing="0" w:after="0" w:afterAutospacing="0"/>
+        <w:ind w:left="720"/>
         <w:rPr>
           <w:rFonts w:ascii="Consolas" w:hAnsi="Consolas"/>
           <w:color w:val="000000"/>
@@ -3780,6 +3780,7 @@
       <w:pPr>
         <w:pStyle w:val="NormalWeb"/>
         <w:spacing w:before="0" w:beforeAutospacing="0" w:after="0" w:afterAutospacing="0"/>
+        <w:ind w:left="720"/>
         <w:rPr>
           <w:rFonts w:ascii="Consolas" w:hAnsi="Consolas"/>
           <w:color w:val="000000"/>
@@ -3801,6 +3802,7 @@
       <w:pPr>
         <w:pStyle w:val="NormalWeb"/>
         <w:spacing w:before="0" w:beforeAutospacing="0" w:after="0" w:afterAutospacing="0"/>
+        <w:ind w:left="720"/>
         <w:rPr>
           <w:rFonts w:ascii="Consolas" w:hAnsi="Consolas"/>
           <w:color w:val="000000"/>
@@ -3924,6 +3926,7 @@
       <w:pPr>
         <w:pStyle w:val="NormalWeb"/>
         <w:spacing w:before="0" w:beforeAutospacing="0" w:after="0" w:afterAutospacing="0"/>
+        <w:ind w:left="720"/>
         <w:rPr>
           <w:rFonts w:ascii="Consolas" w:hAnsi="Consolas"/>
           <w:color w:val="000000"/>
@@ -3945,6 +3948,7 @@
       <w:pPr>
         <w:pStyle w:val="NormalWeb"/>
         <w:spacing w:before="0" w:beforeAutospacing="0" w:after="0" w:afterAutospacing="0"/>
+        <w:ind w:left="720"/>
         <w:rPr>
           <w:rFonts w:ascii="Consolas" w:hAnsi="Consolas"/>
           <w:color w:val="000000"/>
@@ -3966,6 +3970,7 @@
       <w:pPr>
         <w:pStyle w:val="NormalWeb"/>
         <w:spacing w:before="0" w:beforeAutospacing="0" w:after="0" w:afterAutospacing="0"/>
+        <w:ind w:left="720"/>
         <w:rPr>
           <w:rFonts w:ascii="Consolas" w:hAnsi="Consolas"/>
           <w:color w:val="000000"/>
@@ -3989,6 +3994,7 @@
       <w:pPr>
         <w:pStyle w:val="NormalWeb"/>
         <w:spacing w:before="0" w:beforeAutospacing="0" w:after="0" w:afterAutospacing="0"/>
+        <w:ind w:left="720"/>
         <w:rPr>
           <w:rFonts w:ascii="Consolas" w:hAnsi="Consolas"/>
           <w:color w:val="000000"/>
@@ -4010,6 +4016,7 @@
       <w:pPr>
         <w:pStyle w:val="NormalWeb"/>
         <w:spacing w:before="0" w:beforeAutospacing="0" w:after="0" w:afterAutospacing="0"/>
+        <w:ind w:left="720"/>
         <w:rPr>
           <w:rFonts w:ascii="Consolas" w:hAnsi="Consolas"/>
           <w:color w:val="000000"/>
@@ -4133,6 +4140,7 @@
       <w:pPr>
         <w:pStyle w:val="NormalWeb"/>
         <w:spacing w:before="0" w:beforeAutospacing="0" w:after="0" w:afterAutospacing="0"/>
+        <w:ind w:left="720"/>
         <w:rPr>
           <w:rFonts w:ascii="Consolas" w:hAnsi="Consolas"/>
           <w:color w:val="000000"/>
@@ -4207,6 +4215,7 @@
       <w:pPr>
         <w:pStyle w:val="NormalWeb"/>
         <w:spacing w:before="0" w:beforeAutospacing="0" w:after="0" w:afterAutospacing="0"/>
+        <w:ind w:left="720"/>
         <w:rPr>
           <w:rFonts w:ascii="Consolas" w:hAnsi="Consolas"/>
           <w:color w:val="000000"/>
@@ -4228,6 +4237,7 @@
       <w:pPr>
         <w:pStyle w:val="NormalWeb"/>
         <w:spacing w:before="0" w:beforeAutospacing="0" w:after="0" w:afterAutospacing="0"/>
+        <w:ind w:left="720"/>
         <w:rPr>
           <w:rFonts w:ascii="Consolas" w:hAnsi="Consolas"/>
           <w:color w:val="000000"/>
@@ -4251,6 +4261,7 @@
       <w:pPr>
         <w:pStyle w:val="NormalWeb"/>
         <w:spacing w:before="0" w:beforeAutospacing="0" w:after="0" w:afterAutospacing="0"/>
+        <w:ind w:left="720"/>
         <w:rPr>
           <w:rFonts w:ascii="Consolas" w:hAnsi="Consolas"/>
           <w:color w:val="000000"/>
@@ -4272,6 +4283,7 @@
       <w:pPr>
         <w:pStyle w:val="NormalWeb"/>
         <w:spacing w:before="0" w:beforeAutospacing="0" w:after="0" w:afterAutospacing="0"/>
+        <w:ind w:left="720"/>
         <w:rPr>
           <w:rFonts w:ascii="Consolas" w:hAnsi="Consolas"/>
           <w:color w:val="000000"/>
@@ -4293,6 +4305,7 @@
       <w:pPr>
         <w:pStyle w:val="NormalWeb"/>
         <w:spacing w:before="0" w:beforeAutospacing="0" w:after="0" w:afterAutospacing="0"/>
+        <w:ind w:left="720"/>
         <w:rPr>
           <w:rFonts w:ascii="Consolas" w:hAnsi="Consolas"/>
           <w:color w:val="000000"/>
@@ -4314,6 +4327,7 @@
       <w:pPr>
         <w:pStyle w:val="NormalWeb"/>
         <w:spacing w:before="0" w:beforeAutospacing="0" w:after="0" w:afterAutospacing="0"/>
+        <w:ind w:left="720"/>
         <w:rPr>
           <w:rFonts w:ascii="Consolas" w:hAnsi="Consolas"/>
           <w:color w:val="000000"/>
@@ -4335,6 +4349,7 @@
       <w:pPr>
         <w:pStyle w:val="NormalWeb"/>
         <w:spacing w:before="0" w:beforeAutospacing="0" w:after="0" w:afterAutospacing="0"/>
+        <w:ind w:left="720"/>
         <w:rPr>
           <w:rFonts w:ascii="Consolas" w:hAnsi="Consolas"/>
           <w:color w:val="000000"/>
@@ -4366,6 +4381,7 @@
       <w:pPr>
         <w:pStyle w:val="NormalWeb"/>
         <w:spacing w:before="0" w:beforeAutospacing="0" w:after="0" w:afterAutospacing="0"/>
+        <w:ind w:left="720"/>
         <w:rPr>
           <w:rFonts w:ascii="Consolas" w:hAnsi="Consolas"/>
           <w:color w:val="000000"/>
@@ -4387,6 +4403,7 @@
       <w:pPr>
         <w:pStyle w:val="NormalWeb"/>
         <w:spacing w:before="0" w:beforeAutospacing="0" w:after="0" w:afterAutospacing="0"/>
+        <w:ind w:left="720"/>
         <w:rPr>
           <w:rFonts w:ascii="Consolas" w:hAnsi="Consolas"/>
           <w:color w:val="000000"/>
@@ -4481,6 +4498,7 @@
       <w:pPr>
         <w:pStyle w:val="NormalWeb"/>
         <w:spacing w:before="0" w:beforeAutospacing="0" w:after="0" w:afterAutospacing="0"/>
+        <w:ind w:left="720"/>
         <w:rPr>
           <w:rFonts w:ascii="Consolas" w:hAnsi="Consolas"/>
           <w:color w:val="000000"/>
@@ -4502,6 +4520,7 @@
       <w:pPr>
         <w:pStyle w:val="NormalWeb"/>
         <w:spacing w:before="0" w:beforeAutospacing="0" w:after="0" w:afterAutospacing="0"/>
+        <w:ind w:left="720"/>
         <w:rPr>
           <w:rFonts w:ascii="Consolas" w:hAnsi="Consolas"/>
           <w:color w:val="000000"/>
@@ -4523,6 +4542,7 @@
       <w:pPr>
         <w:pStyle w:val="NormalWeb"/>
         <w:spacing w:before="0" w:beforeAutospacing="0" w:after="0" w:afterAutospacing="0"/>
+        <w:ind w:left="720"/>
         <w:rPr>
           <w:rFonts w:ascii="Consolas" w:hAnsi="Consolas"/>
           <w:color w:val="000000"/>
@@ -4606,6 +4626,7 @@
       <w:pPr>
         <w:pStyle w:val="NormalWeb"/>
         <w:spacing w:before="0" w:beforeAutospacing="0" w:after="0" w:afterAutospacing="0"/>
+        <w:ind w:left="720"/>
         <w:rPr>
           <w:rFonts w:ascii="Consolas" w:hAnsi="Consolas"/>
           <w:color w:val="000000"/>
@@ -4627,6 +4648,7 @@
       <w:pPr>
         <w:pStyle w:val="NormalWeb"/>
         <w:spacing w:before="0" w:beforeAutospacing="0" w:after="0" w:afterAutospacing="0"/>
+        <w:ind w:left="720"/>
         <w:rPr>
           <w:rFonts w:ascii="Consolas" w:hAnsi="Consolas"/>
           <w:color w:val="000000"/>
@@ -4648,6 +4670,7 @@
       <w:pPr>
         <w:pStyle w:val="NormalWeb"/>
         <w:spacing w:before="0" w:beforeAutospacing="0" w:after="0" w:afterAutospacing="0"/>
+        <w:ind w:left="720"/>
         <w:rPr>
           <w:rFonts w:ascii="Consolas" w:hAnsi="Consolas"/>
           <w:color w:val="000000"/>
@@ -4669,6 +4692,7 @@
       <w:pPr>
         <w:pStyle w:val="NormalWeb"/>
         <w:spacing w:before="0" w:beforeAutospacing="0" w:after="0" w:afterAutospacing="0"/>
+        <w:ind w:left="720"/>
         <w:rPr>
           <w:rFonts w:ascii="Consolas" w:hAnsi="Consolas"/>
           <w:color w:val="000000"/>
@@ -4692,6 +4716,7 @@
       <w:pPr>
         <w:pStyle w:val="NormalWeb"/>
         <w:spacing w:before="0" w:beforeAutospacing="0" w:after="0" w:afterAutospacing="0"/>
+        <w:ind w:left="720"/>
         <w:rPr>
           <w:rFonts w:ascii="Consolas" w:hAnsi="Consolas"/>
           <w:color w:val="000000"/>
@@ -4713,6 +4738,7 @@
       <w:pPr>
         <w:pStyle w:val="NormalWeb"/>
         <w:spacing w:before="0" w:beforeAutospacing="0" w:after="0" w:afterAutospacing="0"/>
+        <w:ind w:left="720"/>
         <w:rPr>
           <w:rFonts w:ascii="Consolas" w:hAnsi="Consolas"/>
           <w:color w:val="000000"/>
@@ -4767,6 +4793,7 @@
       <w:pPr>
         <w:pStyle w:val="NormalWeb"/>
         <w:spacing w:before="0" w:beforeAutospacing="0" w:after="0" w:afterAutospacing="0"/>
+        <w:ind w:left="720"/>
         <w:rPr>
           <w:rFonts w:ascii="Consolas" w:hAnsi="Consolas"/>
           <w:color w:val="000000"/>
@@ -4828,6 +4855,7 @@
       <w:pPr>
         <w:pStyle w:val="NormalWeb"/>
         <w:spacing w:before="0" w:beforeAutospacing="0" w:after="0" w:afterAutospacing="0"/>
+        <w:ind w:left="720"/>
         <w:rPr>
           <w:rFonts w:ascii="Consolas" w:hAnsi="Consolas"/>
           <w:color w:val="000000"/>
@@ -4880,6 +4908,7 @@
       <w:pPr>
         <w:pStyle w:val="NormalWeb"/>
         <w:spacing w:before="0" w:beforeAutospacing="0" w:after="0" w:afterAutospacing="0"/>
+        <w:ind w:left="720"/>
         <w:rPr>
           <w:rFonts w:ascii="Consolas" w:hAnsi="Consolas"/>
           <w:color w:val="000000"/>
@@ -4901,6 +4930,7 @@
       <w:pPr>
         <w:pStyle w:val="NormalWeb"/>
         <w:spacing w:before="0" w:beforeAutospacing="0" w:after="0" w:afterAutospacing="0"/>
+        <w:ind w:left="720"/>
         <w:rPr>
           <w:rFonts w:ascii="Consolas" w:hAnsi="Consolas"/>
           <w:color w:val="000000"/>
@@ -4948,6 +4978,7 @@
       <w:pPr>
         <w:pStyle w:val="NormalWeb"/>
         <w:spacing w:before="0" w:beforeAutospacing="0" w:after="0" w:afterAutospacing="0"/>
+        <w:ind w:left="720"/>
         <w:rPr>
           <w:rFonts w:ascii="Consolas" w:hAnsi="Consolas"/>
           <w:color w:val="000000"/>
@@ -4969,6 +5000,7 @@
       <w:pPr>
         <w:pStyle w:val="NormalWeb"/>
         <w:spacing w:before="0" w:beforeAutospacing="0" w:after="0" w:afterAutospacing="0"/>
+        <w:ind w:left="720"/>
         <w:rPr>
           <w:rFonts w:ascii="Consolas" w:hAnsi="Consolas"/>
           <w:color w:val="000000"/>
@@ -5010,6 +5042,7 @@
       <w:pPr>
         <w:pStyle w:val="NormalWeb"/>
         <w:spacing w:before="0" w:beforeAutospacing="0" w:after="0" w:afterAutospacing="0"/>
+        <w:ind w:left="720"/>
         <w:rPr>
           <w:rFonts w:ascii="Consolas" w:hAnsi="Consolas"/>
           <w:color w:val="000000"/>
@@ -5062,6 +5095,7 @@
       <w:pPr>
         <w:pStyle w:val="NormalWeb"/>
         <w:spacing w:before="0" w:beforeAutospacing="0" w:after="0" w:afterAutospacing="0"/>
+        <w:ind w:left="720"/>
         <w:rPr>
           <w:rFonts w:ascii="Consolas" w:hAnsi="Consolas"/>
           <w:color w:val="000000"/>
@@ -5083,6 +5117,7 @@
       <w:pPr>
         <w:pStyle w:val="NormalWeb"/>
         <w:spacing w:before="0" w:beforeAutospacing="0" w:after="0" w:afterAutospacing="0"/>
+        <w:ind w:left="720"/>
         <w:rPr>
           <w:rFonts w:ascii="Consolas" w:hAnsi="Consolas"/>
           <w:color w:val="000000"/>
@@ -5104,6 +5139,7 @@
       <w:pPr>
         <w:pStyle w:val="NormalWeb"/>
         <w:spacing w:before="0" w:beforeAutospacing="0" w:after="0" w:afterAutospacing="0"/>
+        <w:ind w:left="720"/>
         <w:rPr>
           <w:rFonts w:ascii="Consolas" w:hAnsi="Consolas"/>
           <w:color w:val="000000"/>
@@ -5164,6 +5200,7 @@
       <w:pPr>
         <w:pStyle w:val="NormalWeb"/>
         <w:spacing w:before="0" w:beforeAutospacing="0" w:after="0" w:afterAutospacing="0"/>
+        <w:ind w:left="720"/>
         <w:rPr>
           <w:rFonts w:ascii="Consolas" w:hAnsi="Consolas"/>
           <w:color w:val="000000"/>
@@ -5185,6 +5222,7 @@
       <w:pPr>
         <w:pStyle w:val="NormalWeb"/>
         <w:spacing w:before="0" w:beforeAutospacing="0" w:after="0" w:afterAutospacing="0"/>
+        <w:ind w:left="720"/>
         <w:rPr>
           <w:rFonts w:ascii="Consolas" w:hAnsi="Consolas"/>
           <w:color w:val="000000"/>
@@ -5279,6 +5317,7 @@
       <w:pPr>
         <w:pStyle w:val="NormalWeb"/>
         <w:spacing w:before="0" w:beforeAutospacing="0" w:after="0" w:afterAutospacing="0"/>
+        <w:ind w:left="720"/>
         <w:rPr>
           <w:rFonts w:ascii="Consolas" w:hAnsi="Consolas"/>
           <w:color w:val="000000"/>
@@ -5300,6 +5339,7 @@
       <w:pPr>
         <w:pStyle w:val="NormalWeb"/>
         <w:spacing w:before="0" w:beforeAutospacing="0" w:after="0" w:afterAutospacing="0"/>
+        <w:ind w:left="720"/>
         <w:rPr>
           <w:rFonts w:ascii="Consolas" w:hAnsi="Consolas"/>
           <w:color w:val="000000"/>
@@ -9627,6 +9667,7 @@
   <w:style w:type="character" w:default="1" w:styleId="DefaultParagraphFont">
     <w:name w:val="Default Paragraph Font"/>
     <w:uiPriority w:val="1"/>
+    <w:semiHidden/>
     <w:unhideWhenUsed/>
   </w:style>
   <w:style w:type="table" w:default="1" w:styleId="TableNormal">

</xml_diff>